<commit_message>
fix button on home page
</commit_message>
<xml_diff>
--- a/documents/specs_and_test_scenarios.docx
+++ b/documents/specs_and_test_scenarios.docx
@@ -10,8 +10,6 @@
           <w:sz w:val="28"/>
         </w:rPr>
       </w:pPr>
-      <w:bookmarkStart w:id="0" w:name="_GoBack"/>
-      <w:bookmarkEnd w:id="0"/>
       <w:r>
         <w:rPr>
           <w:sz w:val="28"/>
@@ -190,11 +188,21 @@
       <w:pPr>
         <w:pStyle w:val="a3"/>
       </w:pPr>
-      <w:fldSimple w:instr=" TITLE  &quot;Спецификации и сценарии тестов&quot;  \* MERGEFORMAT ">
-        <w:r>
-          <w:t>Спецификации и сценарии тестов</w:t>
-        </w:r>
-      </w:fldSimple>
+      <w:r>
+        <w:fldChar w:fldCharType="begin"/>
+      </w:r>
+      <w:r>
+        <w:instrText xml:space="preserve"> TITLE  "Спецификации и сценарии тестов"  \* MERGEFORMAT </w:instrText>
+      </w:r>
+      <w:r>
+        <w:fldChar w:fldCharType="separate"/>
+      </w:r>
+      <w:r>
+        <w:t>Спецификации и сценарии тестов</w:t>
+      </w:r>
+      <w:r>
+        <w:fldChar w:fldCharType="end"/>
+      </w:r>
     </w:p>
     <w:p>
       <w:pPr>
@@ -284,10 +292,10 @@
         <w:t>Содержание</w:t>
       </w:r>
     </w:p>
-    <w:bookmarkStart w:id="1" w:name="_Toc114815999"/>
-    <w:bookmarkStart w:id="2" w:name="_Toc114823010"/>
-    <w:bookmarkStart w:id="3" w:name="_Toc115845556"/>
-    <w:bookmarkStart w:id="4" w:name="_Toc115845555"/>
+    <w:bookmarkStart w:id="0" w:name="_Toc114815999"/>
+    <w:bookmarkStart w:id="1" w:name="_Toc114823010"/>
+    <w:bookmarkStart w:id="2" w:name="_Toc115845556"/>
+    <w:bookmarkStart w:id="3" w:name="_Toc115845555"/>
     <w:p>
       <w:pPr>
         <w:pStyle w:val="10"/>
@@ -1756,12 +1764,12 @@
         <w:pStyle w:val="1"/>
         <w:pageBreakBefore/>
       </w:pPr>
+      <w:bookmarkStart w:id="4" w:name="_Toc213253504"/>
       <w:bookmarkStart w:id="5" w:name="_Toc143454649"/>
-      <w:bookmarkStart w:id="6" w:name="_Toc213253504"/>
+      <w:bookmarkEnd w:id="0"/>
       <w:bookmarkEnd w:id="1"/>
       <w:bookmarkEnd w:id="2"/>
       <w:bookmarkEnd w:id="3"/>
-      <w:bookmarkEnd w:id="4"/>
       <w:r>
         <w:lastRenderedPageBreak/>
         <w:t>Спецификации на вход</w:t>
@@ -1769,7 +1777,7 @@
       <w:r>
         <w:t>ы</w:t>
       </w:r>
-      <w:bookmarkEnd w:id="6"/>
+      <w:bookmarkEnd w:id="4"/>
     </w:p>
     <w:p>
       <w:pPr>
@@ -1872,7 +1880,23 @@
         <w:t xml:space="preserve">: </w:t>
       </w:r>
       <w:r>
-        <w:t>строковые данные, валидируемые на стороне клиента и сервера. Пароли хранятся в хэшированном виде в БД.</w:t>
+        <w:t xml:space="preserve">строковые данные, </w:t>
+      </w:r>
+      <w:proofErr w:type="spellStart"/>
+      <w:r>
+        <w:t>валидируемые</w:t>
+      </w:r>
+      <w:proofErr w:type="spellEnd"/>
+      <w:r>
+        <w:t xml:space="preserve"> на стороне клиента и сервера. Пароли хранятся в </w:t>
+      </w:r>
+      <w:proofErr w:type="spellStart"/>
+      <w:r>
+        <w:t>хэшированном</w:t>
+      </w:r>
+      <w:proofErr w:type="spellEnd"/>
+      <w:r>
+        <w:t xml:space="preserve"> виде в БД.</w:t>
       </w:r>
     </w:p>
     <w:p>
@@ -1919,12 +1943,14 @@
       <w:r>
         <w:t xml:space="preserve">предварительно заполненная таблица </w:t>
       </w:r>
+      <w:proofErr w:type="spellStart"/>
       <w:r>
         <w:rPr>
           <w:lang w:val="en-US"/>
         </w:rPr>
         <w:t>ServiceType</w:t>
       </w:r>
+      <w:proofErr w:type="spellEnd"/>
       <w:r>
         <w:t xml:space="preserve"> в базе данных.</w:t>
       </w:r>
@@ -1976,12 +2002,14 @@
       <w:r>
         <w:t xml:space="preserve"> </w:t>
       </w:r>
+      <w:proofErr w:type="spellStart"/>
       <w:r>
         <w:rPr>
           <w:lang w:val="en-US"/>
         </w:rPr>
         <w:t>WorkingHours</w:t>
       </w:r>
+      <w:proofErr w:type="spellEnd"/>
       <w:r>
         <w:t xml:space="preserve"> </w:t>
       </w:r>
@@ -2257,45 +2285,53 @@
         </w:rPr>
         <w:t xml:space="preserve"> (</w:t>
       </w:r>
+      <w:proofErr w:type="spellStart"/>
       <w:r>
         <w:t>эндпоинты</w:t>
       </w:r>
+      <w:proofErr w:type="spellEnd"/>
       <w:r>
         <w:rPr>
           <w:lang w:val="en-US"/>
         </w:rPr>
         <w:t xml:space="preserve"> /</w:t>
       </w:r>
+      <w:proofErr w:type="spellStart"/>
       <w:r>
         <w:rPr>
           <w:lang w:val="en-US"/>
         </w:rPr>
         <w:t>api</w:t>
       </w:r>
+      <w:proofErr w:type="spellEnd"/>
       <w:r>
         <w:rPr>
           <w:lang w:val="en-US"/>
         </w:rPr>
         <w:t>/</w:t>
       </w:r>
+      <w:proofErr w:type="spellStart"/>
       <w:r>
         <w:rPr>
           <w:lang w:val="en-US"/>
         </w:rPr>
         <w:t>auth</w:t>
       </w:r>
+      <w:proofErr w:type="spellEnd"/>
       <w:r>
         <w:rPr>
           <w:lang w:val="en-US"/>
         </w:rPr>
         <w:t>/, /</w:t>
       </w:r>
+      <w:proofErr w:type="spellStart"/>
       <w:r>
         <w:rPr>
           <w:lang w:val="en-US"/>
         </w:rPr>
         <w:t>api</w:t>
       </w:r>
+      <w:proofErr w:type="spellEnd"/>
       <w:r>
         <w:rPr>
           <w:lang w:val="en-US"/>
@@ -2318,7 +2354,35 @@
         <w:rPr>
           <w:lang w:val="en-US"/>
         </w:rPr>
-        <w:t>/api/appointments/, /api/parts/</w:t>
+        <w:t>/</w:t>
+      </w:r>
+      <w:proofErr w:type="spellStart"/>
+      <w:r>
+        <w:rPr>
+          <w:lang w:val="en-US"/>
+        </w:rPr>
+        <w:t>api</w:t>
+      </w:r>
+      <w:proofErr w:type="spellEnd"/>
+      <w:r>
+        <w:rPr>
+          <w:lang w:val="en-US"/>
+        </w:rPr>
+        <w:t>/appointments/, /</w:t>
+      </w:r>
+      <w:proofErr w:type="spellStart"/>
+      <w:r>
+        <w:rPr>
+          <w:lang w:val="en-US"/>
+        </w:rPr>
+        <w:t>api</w:t>
+      </w:r>
+      <w:proofErr w:type="spellEnd"/>
+      <w:r>
+        <w:rPr>
+          <w:lang w:val="en-US"/>
+        </w:rPr>
+        <w:t>/parts/</w:t>
       </w:r>
       <w:r>
         <w:rPr>
@@ -2379,15 +2443,22 @@
         <w:t>Нажатия кнопок, заполнение форм, выбор элементов из выпадающих списков в клиентском и менеджерском веб-интерфейсах.</w:t>
       </w:r>
     </w:p>
+    <w:p/>
+    <w:p/>
+    <w:p/>
+    <w:p/>
+    <w:p/>
+    <w:p/>
     <w:p>
       <w:pPr>
         <w:pStyle w:val="1"/>
       </w:pPr>
-      <w:bookmarkStart w:id="7" w:name="_Toc213253505"/>
-      <w:r>
+      <w:bookmarkStart w:id="6" w:name="_Toc213253505"/>
+      <w:r>
+        <w:lastRenderedPageBreak/>
         <w:t>Спецификации на выходы</w:t>
       </w:r>
-      <w:bookmarkEnd w:id="7"/>
+      <w:bookmarkEnd w:id="6"/>
     </w:p>
     <w:p>
       <w:pPr>
@@ -2420,13 +2491,34 @@
         <w:spacing w:after="0" w:afterAutospacing="0"/>
         <w:rPr>
           <w:szCs w:val="20"/>
-        </w:rPr>
-      </w:pPr>
-      <w:r>
-        <w:rPr>
-          <w:szCs w:val="20"/>
-        </w:rPr>
-        <w:t>Статус-коды HTTP (200 OK, 201 Created, 400 Bad Request, 401 Unauthorized, 404 Not Found).</w:t>
+          <w:lang w:val="en-US"/>
+        </w:rPr>
+      </w:pPr>
+      <w:r>
+        <w:rPr>
+          <w:szCs w:val="20"/>
+        </w:rPr>
+        <w:t>Статус</w:t>
+      </w:r>
+      <w:r>
+        <w:rPr>
+          <w:szCs w:val="20"/>
+          <w:lang w:val="en-US"/>
+        </w:rPr>
+        <w:t>-</w:t>
+      </w:r>
+      <w:r>
+        <w:rPr>
+          <w:szCs w:val="20"/>
+        </w:rPr>
+        <w:t>коды</w:t>
+      </w:r>
+      <w:r>
+        <w:rPr>
+          <w:szCs w:val="20"/>
+          <w:lang w:val="en-US"/>
+        </w:rPr>
+        <w:t xml:space="preserve"> HTTP (200 OK, 201 Created, 400 Bad Request, 401 Unauthorized, 404 Not Found).</w:t>
       </w:r>
     </w:p>
     <w:p>
@@ -2466,7 +2558,6 @@
         <w:rPr>
           <w:szCs w:val="20"/>
         </w:rPr>
-        <w:lastRenderedPageBreak/>
         <w:t>Сообщения системы:</w:t>
       </w:r>
     </w:p>
@@ -2549,27 +2640,33 @@
         </w:rPr>
         <w:t>Создание новых записей в таблицах </w:t>
       </w:r>
+      <w:proofErr w:type="spellStart"/>
       <w:r>
         <w:t>UserProfile</w:t>
       </w:r>
+      <w:proofErr w:type="spellEnd"/>
       <w:r>
         <w:rPr>
           <w:szCs w:val="20"/>
         </w:rPr>
         <w:t>, </w:t>
       </w:r>
+      <w:proofErr w:type="spellStart"/>
       <w:r>
         <w:t>Appointment</w:t>
       </w:r>
+      <w:proofErr w:type="spellEnd"/>
       <w:r>
         <w:rPr>
           <w:szCs w:val="20"/>
         </w:rPr>
         <w:t>, </w:t>
       </w:r>
+      <w:proofErr w:type="spellStart"/>
       <w:r>
         <w:t>PartsOrder</w:t>
       </w:r>
+      <w:proofErr w:type="spellEnd"/>
       <w:r>
         <w:rPr>
           <w:szCs w:val="20"/>
@@ -2596,18 +2693,22 @@
         </w:rPr>
         <w:t>Обновление полей (например, </w:t>
       </w:r>
+      <w:proofErr w:type="spellStart"/>
       <w:r>
         <w:t>status</w:t>
       </w:r>
+      <w:proofErr w:type="spellEnd"/>
       <w:r>
         <w:rPr>
           <w:szCs w:val="20"/>
         </w:rPr>
         <w:t> в </w:t>
       </w:r>
+      <w:proofErr w:type="spellStart"/>
       <w:r>
         <w:t>Appointment</w:t>
       </w:r>
+      <w:proofErr w:type="spellEnd"/>
       <w:r>
         <w:rPr>
           <w:szCs w:val="20"/>
@@ -2728,11 +2829,19 @@
           <w:szCs w:val="20"/>
         </w:rPr>
       </w:pPr>
-      <w:r>
-        <w:rPr>
-          <w:szCs w:val="20"/>
-        </w:rPr>
-        <w:t>Логи приложения:</w:t>
+      <w:proofErr w:type="spellStart"/>
+      <w:r>
+        <w:rPr>
+          <w:szCs w:val="20"/>
+        </w:rPr>
+        <w:t>Логи</w:t>
+      </w:r>
+      <w:proofErr w:type="spellEnd"/>
+      <w:r>
+        <w:rPr>
+          <w:szCs w:val="20"/>
+        </w:rPr>
+        <w:t xml:space="preserve"> приложения:</w:t>
       </w:r>
     </w:p>
     <w:p>
@@ -2756,15 +2865,29 @@
       </w:r>
     </w:p>
     <w:p/>
+    <w:p/>
+    <w:p/>
+    <w:p/>
+    <w:p/>
+    <w:p/>
+    <w:p/>
+    <w:p/>
+    <w:p/>
+    <w:p/>
+    <w:p/>
+    <w:p/>
+    <w:p/>
+    <w:p/>
     <w:p>
       <w:pPr>
         <w:pStyle w:val="1"/>
       </w:pPr>
-      <w:bookmarkStart w:id="8" w:name="_Toc213253506"/>
-      <w:r>
+      <w:bookmarkStart w:id="7" w:name="_Toc213253506"/>
+      <w:r>
+        <w:lastRenderedPageBreak/>
         <w:t>Среда тестирования</w:t>
       </w:r>
-      <w:bookmarkEnd w:id="8"/>
+      <w:bookmarkEnd w:id="7"/>
     </w:p>
     <w:p>
       <w:pPr>
@@ -2863,7 +2986,63 @@
         <w:rPr>
           <w:szCs w:val="20"/>
         </w:rPr>
-        <w:t>Операционная система: Windows 10/11, macOS последних версий, Linux (Ubuntu 20.04+).</w:t>
+        <w:t>Операционная система: </w:t>
+      </w:r>
+      <w:proofErr w:type="spellStart"/>
+      <w:r>
+        <w:rPr>
+          <w:szCs w:val="20"/>
+        </w:rPr>
+        <w:t>Windows</w:t>
+      </w:r>
+      <w:proofErr w:type="spellEnd"/>
+      <w:r>
+        <w:rPr>
+          <w:szCs w:val="20"/>
+        </w:rPr>
+        <w:t xml:space="preserve"> 10/11, </w:t>
+      </w:r>
+      <w:proofErr w:type="spellStart"/>
+      <w:r>
+        <w:rPr>
+          <w:szCs w:val="20"/>
+        </w:rPr>
+        <w:t>macOS</w:t>
+      </w:r>
+      <w:proofErr w:type="spellEnd"/>
+      <w:r>
+        <w:rPr>
+          <w:szCs w:val="20"/>
+        </w:rPr>
+        <w:t xml:space="preserve"> последних версий, </w:t>
+      </w:r>
+      <w:proofErr w:type="spellStart"/>
+      <w:r>
+        <w:rPr>
+          <w:szCs w:val="20"/>
+        </w:rPr>
+        <w:t>Linux</w:t>
+      </w:r>
+      <w:proofErr w:type="spellEnd"/>
+      <w:r>
+        <w:rPr>
+          <w:szCs w:val="20"/>
+        </w:rPr>
+        <w:t xml:space="preserve"> (</w:t>
+      </w:r>
+      <w:proofErr w:type="spellStart"/>
+      <w:r>
+        <w:rPr>
+          <w:szCs w:val="20"/>
+        </w:rPr>
+        <w:t>Ubuntu</w:t>
+      </w:r>
+      <w:proofErr w:type="spellEnd"/>
+      <w:r>
+        <w:rPr>
+          <w:szCs w:val="20"/>
+        </w:rPr>
+        <w:t xml:space="preserve"> 20.04+).</w:t>
       </w:r>
     </w:p>
     <w:p>
@@ -2895,7 +3074,119 @@
         <w:rPr>
           <w:szCs w:val="20"/>
         </w:rPr>
-        <w:t>оследние версии Google Chrome, Mozilla Firefox, Apple Safari, Microsoft Edge.</w:t>
+        <w:t xml:space="preserve">оследние версии </w:t>
+      </w:r>
+      <w:proofErr w:type="spellStart"/>
+      <w:r>
+        <w:rPr>
+          <w:szCs w:val="20"/>
+        </w:rPr>
+        <w:t>Google</w:t>
+      </w:r>
+      <w:proofErr w:type="spellEnd"/>
+      <w:r>
+        <w:rPr>
+          <w:szCs w:val="20"/>
+        </w:rPr>
+        <w:t xml:space="preserve"> </w:t>
+      </w:r>
+      <w:proofErr w:type="spellStart"/>
+      <w:r>
+        <w:rPr>
+          <w:szCs w:val="20"/>
+        </w:rPr>
+        <w:t>Chrome</w:t>
+      </w:r>
+      <w:proofErr w:type="spellEnd"/>
+      <w:r>
+        <w:rPr>
+          <w:szCs w:val="20"/>
+        </w:rPr>
+        <w:t xml:space="preserve">, </w:t>
+      </w:r>
+      <w:proofErr w:type="spellStart"/>
+      <w:r>
+        <w:rPr>
+          <w:szCs w:val="20"/>
+        </w:rPr>
+        <w:t>Mozilla</w:t>
+      </w:r>
+      <w:proofErr w:type="spellEnd"/>
+      <w:r>
+        <w:rPr>
+          <w:szCs w:val="20"/>
+        </w:rPr>
+        <w:t xml:space="preserve"> </w:t>
+      </w:r>
+      <w:proofErr w:type="spellStart"/>
+      <w:r>
+        <w:rPr>
+          <w:szCs w:val="20"/>
+        </w:rPr>
+        <w:t>Firefox</w:t>
+      </w:r>
+      <w:proofErr w:type="spellEnd"/>
+      <w:r>
+        <w:rPr>
+          <w:szCs w:val="20"/>
+        </w:rPr>
+        <w:t xml:space="preserve">, </w:t>
+      </w:r>
+      <w:proofErr w:type="spellStart"/>
+      <w:r>
+        <w:rPr>
+          <w:szCs w:val="20"/>
+        </w:rPr>
+        <w:t>Apple</w:t>
+      </w:r>
+      <w:proofErr w:type="spellEnd"/>
+      <w:r>
+        <w:rPr>
+          <w:szCs w:val="20"/>
+        </w:rPr>
+        <w:t xml:space="preserve"> </w:t>
+      </w:r>
+      <w:proofErr w:type="spellStart"/>
+      <w:r>
+        <w:rPr>
+          <w:szCs w:val="20"/>
+        </w:rPr>
+        <w:t>Safari</w:t>
+      </w:r>
+      <w:proofErr w:type="spellEnd"/>
+      <w:r>
+        <w:rPr>
+          <w:szCs w:val="20"/>
+        </w:rPr>
+        <w:t xml:space="preserve">, </w:t>
+      </w:r>
+      <w:proofErr w:type="spellStart"/>
+      <w:r>
+        <w:rPr>
+          <w:szCs w:val="20"/>
+        </w:rPr>
+        <w:t>Microsoft</w:t>
+      </w:r>
+      <w:proofErr w:type="spellEnd"/>
+      <w:r>
+        <w:rPr>
+          <w:szCs w:val="20"/>
+        </w:rPr>
+        <w:t xml:space="preserve"> </w:t>
+      </w:r>
+      <w:proofErr w:type="spellStart"/>
+      <w:r>
+        <w:rPr>
+          <w:szCs w:val="20"/>
+        </w:rPr>
+        <w:t>Edge</w:t>
+      </w:r>
+      <w:proofErr w:type="spellEnd"/>
+      <w:r>
+        <w:rPr>
+          <w:szCs w:val="20"/>
+        </w:rPr>
+        <w:t>.</w:t>
       </w:r>
     </w:p>
     <w:p>
@@ -2917,6 +3208,7 @@
         </w:rPr>
         <w:t>Веб-сервер: </w:t>
       </w:r>
+      <w:proofErr w:type="spellStart"/>
       <w:r>
         <w:rPr>
           <w:szCs w:val="20"/>
@@ -2927,16 +3219,56 @@
         <w:rPr>
           <w:szCs w:val="20"/>
         </w:rPr>
-        <w:t>азработческий сервер Django (</w:t>
-      </w:r>
-      <w:r>
-        <w:t>manage.py runserver</w:t>
-      </w:r>
-      <w:r>
-        <w:rPr>
-          <w:szCs w:val="20"/>
-        </w:rPr>
-        <w:t>), либо производственный сервер (например, Gunicorn).</w:t>
+        <w:t>азработческий</w:t>
+      </w:r>
+      <w:proofErr w:type="spellEnd"/>
+      <w:r>
+        <w:rPr>
+          <w:szCs w:val="20"/>
+        </w:rPr>
+        <w:t xml:space="preserve"> сервер </w:t>
+      </w:r>
+      <w:proofErr w:type="spellStart"/>
+      <w:r>
+        <w:rPr>
+          <w:szCs w:val="20"/>
+        </w:rPr>
+        <w:t>Django</w:t>
+      </w:r>
+      <w:proofErr w:type="spellEnd"/>
+      <w:r>
+        <w:rPr>
+          <w:szCs w:val="20"/>
+        </w:rPr>
+        <w:t xml:space="preserve"> (</w:t>
+      </w:r>
+      <w:r>
+        <w:t xml:space="preserve">manage.py </w:t>
+      </w:r>
+      <w:proofErr w:type="spellStart"/>
+      <w:r>
+        <w:t>runserver</w:t>
+      </w:r>
+      <w:proofErr w:type="spellEnd"/>
+      <w:r>
+        <w:rPr>
+          <w:szCs w:val="20"/>
+        </w:rPr>
+        <w:t xml:space="preserve">), либо производственный сервер (например, </w:t>
+      </w:r>
+      <w:proofErr w:type="spellStart"/>
+      <w:r>
+        <w:rPr>
+          <w:szCs w:val="20"/>
+        </w:rPr>
+        <w:t>Gunicorn</w:t>
+      </w:r>
+      <w:proofErr w:type="spellEnd"/>
+      <w:r>
+        <w:rPr>
+          <w:szCs w:val="20"/>
+        </w:rPr>
+        <w:t>).</w:t>
       </w:r>
     </w:p>
     <w:p>
@@ -2956,7 +3288,49 @@
         <w:rPr>
           <w:szCs w:val="20"/>
         </w:rPr>
-        <w:t>База данных: SQLite (для разработки и начального тестирования), PostgreSQL (для тестирования в продакшн-подобной среде).</w:t>
+        <w:t>База данных: </w:t>
+      </w:r>
+      <w:proofErr w:type="spellStart"/>
+      <w:r>
+        <w:rPr>
+          <w:szCs w:val="20"/>
+        </w:rPr>
+        <w:t>SQLite</w:t>
+      </w:r>
+      <w:proofErr w:type="spellEnd"/>
+      <w:r>
+        <w:rPr>
+          <w:szCs w:val="20"/>
+        </w:rPr>
+        <w:t xml:space="preserve"> (для разработки и начального тестирования), </w:t>
+      </w:r>
+      <w:proofErr w:type="spellStart"/>
+      <w:r>
+        <w:rPr>
+          <w:szCs w:val="20"/>
+        </w:rPr>
+        <w:t>PostgreSQL</w:t>
+      </w:r>
+      <w:proofErr w:type="spellEnd"/>
+      <w:r>
+        <w:rPr>
+          <w:szCs w:val="20"/>
+        </w:rPr>
+        <w:t xml:space="preserve"> (для тестирования в </w:t>
+      </w:r>
+      <w:proofErr w:type="spellStart"/>
+      <w:r>
+        <w:rPr>
+          <w:szCs w:val="20"/>
+        </w:rPr>
+        <w:t>продакшн</w:t>
+      </w:r>
+      <w:proofErr w:type="spellEnd"/>
+      <w:r>
+        <w:rPr>
+          <w:szCs w:val="20"/>
+        </w:rPr>
+        <w:t>-подобной среде).</w:t>
       </w:r>
     </w:p>
     <w:p>
@@ -3028,7 +3402,6 @@
         <w:rPr>
           <w:szCs w:val="20"/>
         </w:rPr>
-        <w:lastRenderedPageBreak/>
         <w:t>Автоматизация тестов: </w:t>
       </w:r>
       <w:r>
@@ -3041,20 +3414,54 @@
         <w:rPr>
           <w:szCs w:val="20"/>
         </w:rPr>
-        <w:t>аписание unit-тестов и интеграционных тестов с использованием </w:t>
-      </w:r>
+        <w:t xml:space="preserve">аписание </w:t>
+      </w:r>
+      <w:proofErr w:type="spellStart"/>
+      <w:r>
+        <w:rPr>
+          <w:szCs w:val="20"/>
+        </w:rPr>
+        <w:t>unit</w:t>
+      </w:r>
+      <w:proofErr w:type="spellEnd"/>
+      <w:r>
+        <w:rPr>
+          <w:szCs w:val="20"/>
+        </w:rPr>
+        <w:t>-тестов и интеграционных тестов с использованием </w:t>
+      </w:r>
+      <w:proofErr w:type="spellStart"/>
       <w:r>
         <w:t>pytest</w:t>
       </w:r>
+      <w:proofErr w:type="spellEnd"/>
       <w:r>
         <w:rPr>
           <w:szCs w:val="20"/>
         </w:rPr>
         <w:t> и </w:t>
       </w:r>
-      <w:r>
-        <w:t>Django Test Case</w:t>
-      </w:r>
+      <w:proofErr w:type="spellStart"/>
+      <w:r>
+        <w:t>Django</w:t>
+      </w:r>
+      <w:proofErr w:type="spellEnd"/>
+      <w:r>
+        <w:t xml:space="preserve"> </w:t>
+      </w:r>
+      <w:proofErr w:type="spellStart"/>
+      <w:r>
+        <w:t>Test</w:t>
+      </w:r>
+      <w:proofErr w:type="spellEnd"/>
+      <w:r>
+        <w:t xml:space="preserve"> </w:t>
+      </w:r>
+      <w:proofErr w:type="spellStart"/>
+      <w:r>
+        <w:t>Case</w:t>
+      </w:r>
+      <w:proofErr w:type="spellEnd"/>
       <w:r>
         <w:rPr>
           <w:szCs w:val="20"/>
@@ -3091,7 +3498,49 @@
         <w:rPr>
           <w:szCs w:val="20"/>
         </w:rPr>
-        <w:t>нструменты Postman или Insomnia для проверки работы REST эндпоинтов.</w:t>
+        <w:t xml:space="preserve">нструменты </w:t>
+      </w:r>
+      <w:proofErr w:type="spellStart"/>
+      <w:r>
+        <w:rPr>
+          <w:szCs w:val="20"/>
+        </w:rPr>
+        <w:t>Postman</w:t>
+      </w:r>
+      <w:proofErr w:type="spellEnd"/>
+      <w:r>
+        <w:rPr>
+          <w:szCs w:val="20"/>
+        </w:rPr>
+        <w:t xml:space="preserve"> или </w:t>
+      </w:r>
+      <w:proofErr w:type="spellStart"/>
+      <w:r>
+        <w:rPr>
+          <w:szCs w:val="20"/>
+        </w:rPr>
+        <w:t>Insomnia</w:t>
+      </w:r>
+      <w:proofErr w:type="spellEnd"/>
+      <w:r>
+        <w:rPr>
+          <w:szCs w:val="20"/>
+        </w:rPr>
+        <w:t xml:space="preserve"> для проверки работы REST </w:t>
+      </w:r>
+      <w:proofErr w:type="spellStart"/>
+      <w:r>
+        <w:rPr>
+          <w:szCs w:val="20"/>
+        </w:rPr>
+        <w:t>эндпоинтов</w:t>
+      </w:r>
+      <w:proofErr w:type="spellEnd"/>
+      <w:r>
+        <w:rPr>
+          <w:szCs w:val="20"/>
+        </w:rPr>
+        <w:t>.</w:t>
       </w:r>
     </w:p>
     <w:p>
@@ -3131,7 +3580,35 @@
         <w:rPr>
           <w:szCs w:val="20"/>
         </w:rPr>
-        <w:t>Система развернута на облачном хостинге (например, PythonAnywhere, Heroku) в демонстрационных целях, что также используется как тестовая среда.</w:t>
+        <w:t xml:space="preserve">Система развернута на облачном хостинге (например, </w:t>
+      </w:r>
+      <w:proofErr w:type="spellStart"/>
+      <w:r>
+        <w:rPr>
+          <w:szCs w:val="20"/>
+        </w:rPr>
+        <w:t>PythonAnywhere</w:t>
+      </w:r>
+      <w:proofErr w:type="spellEnd"/>
+      <w:r>
+        <w:rPr>
+          <w:szCs w:val="20"/>
+        </w:rPr>
+        <w:t xml:space="preserve">, </w:t>
+      </w:r>
+      <w:proofErr w:type="spellStart"/>
+      <w:r>
+        <w:rPr>
+          <w:szCs w:val="20"/>
+        </w:rPr>
+        <w:t>Heroku</w:t>
+      </w:r>
+      <w:proofErr w:type="spellEnd"/>
+      <w:r>
+        <w:rPr>
+          <w:szCs w:val="20"/>
+        </w:rPr>
+        <w:t>) в демонстрационных целях, что также используется как тестовая среда.</w:t>
       </w:r>
     </w:p>
     <w:p/>
@@ -3139,11 +3616,11 @@
       <w:pPr>
         <w:pStyle w:val="1"/>
       </w:pPr>
-      <w:bookmarkStart w:id="9" w:name="_Toc213253507"/>
+      <w:bookmarkStart w:id="8" w:name="_Toc213253507"/>
       <w:r>
         <w:t>Специальные требования</w:t>
       </w:r>
-      <w:bookmarkEnd w:id="9"/>
+      <w:bookmarkEnd w:id="8"/>
     </w:p>
     <w:p>
       <w:pPr>
@@ -3206,7 +3683,21 @@
         <w:rPr>
           <w:szCs w:val="20"/>
         </w:rPr>
-        <w:t>олжны быть созданы и предоставлены тестировщикам как минимум две тестовые учетные записи: "Клиент" и "Менеджер".</w:t>
+        <w:t xml:space="preserve">олжны быть созданы и предоставлены </w:t>
+      </w:r>
+      <w:proofErr w:type="spellStart"/>
+      <w:r>
+        <w:rPr>
+          <w:szCs w:val="20"/>
+        </w:rPr>
+        <w:t>тестировщикам</w:t>
+      </w:r>
+      <w:proofErr w:type="spellEnd"/>
+      <w:r>
+        <w:rPr>
+          <w:szCs w:val="20"/>
+        </w:rPr>
+        <w:t xml:space="preserve"> как минимум две тестовые учетные записи: "Клиент" и "Менеджер".</w:t>
       </w:r>
     </w:p>
     <w:p>
@@ -3270,7 +3761,35 @@
         <w:rPr>
           <w:szCs w:val="20"/>
         </w:rPr>
-        <w:t>естирование должно включать проверки на уязвимости, такие как SQL-инъекции, XSS, CSRF (в рамках возможностей фреймворков Django и DRF).</w:t>
+        <w:t xml:space="preserve">естирование должно включать проверки на уязвимости, такие как SQL-инъекции, XSS, CSRF (в рамках возможностей </w:t>
+      </w:r>
+      <w:proofErr w:type="spellStart"/>
+      <w:r>
+        <w:rPr>
+          <w:szCs w:val="20"/>
+        </w:rPr>
+        <w:t>фреймворков</w:t>
+      </w:r>
+      <w:proofErr w:type="spellEnd"/>
+      <w:r>
+        <w:rPr>
+          <w:szCs w:val="20"/>
+        </w:rPr>
+        <w:t xml:space="preserve"> </w:t>
+      </w:r>
+      <w:proofErr w:type="spellStart"/>
+      <w:r>
+        <w:rPr>
+          <w:szCs w:val="20"/>
+        </w:rPr>
+        <w:t>Django</w:t>
+      </w:r>
+      <w:proofErr w:type="spellEnd"/>
+      <w:r>
+        <w:rPr>
+          <w:szCs w:val="20"/>
+        </w:rPr>
+        <w:t xml:space="preserve"> и DRF).</w:t>
       </w:r>
     </w:p>
     <w:p>
@@ -3287,11 +3806,19 @@
           <w:color w:val="0F1115"/>
         </w:rPr>
       </w:pPr>
-      <w:r>
-        <w:rPr>
-          <w:szCs w:val="20"/>
-        </w:rPr>
-        <w:t>Воспроизводимость: </w:t>
+      <w:proofErr w:type="spellStart"/>
+      <w:r>
+        <w:rPr>
+          <w:szCs w:val="20"/>
+        </w:rPr>
+        <w:t>Воспроизводимость</w:t>
+      </w:r>
+      <w:proofErr w:type="spellEnd"/>
+      <w:r>
+        <w:rPr>
+          <w:szCs w:val="20"/>
+        </w:rPr>
+        <w:t>: </w:t>
       </w:r>
       <w:r>
         <w:rPr>
@@ -3303,7 +3830,35 @@
         <w:rPr>
           <w:szCs w:val="20"/>
         </w:rPr>
-        <w:t>аждый тест-кейс должен быть воспроизводим. Для этого необходимо очищать или переинициализировать состояние базы данных перед каждым прогоном критических тестов (например, с помощью транзакций или фикстур).</w:t>
+        <w:t xml:space="preserve">аждый тест-кейс должен быть воспроизводим. Для этого необходимо очищать или </w:t>
+      </w:r>
+      <w:proofErr w:type="spellStart"/>
+      <w:r>
+        <w:rPr>
+          <w:szCs w:val="20"/>
+        </w:rPr>
+        <w:t>переинициализировать</w:t>
+      </w:r>
+      <w:proofErr w:type="spellEnd"/>
+      <w:r>
+        <w:rPr>
+          <w:szCs w:val="20"/>
+        </w:rPr>
+        <w:t xml:space="preserve"> состояние базы данных перед каждым прогоном критических тестов (например, с помощью транзакций или </w:t>
+      </w:r>
+      <w:proofErr w:type="spellStart"/>
+      <w:r>
+        <w:rPr>
+          <w:szCs w:val="20"/>
+        </w:rPr>
+        <w:t>фикстур</w:t>
+      </w:r>
+      <w:proofErr w:type="spellEnd"/>
+      <w:r>
+        <w:rPr>
+          <w:szCs w:val="20"/>
+        </w:rPr>
+        <w:t>).</w:t>
       </w:r>
     </w:p>
     <w:p/>
@@ -3311,11 +3866,12 @@
       <w:pPr>
         <w:pStyle w:val="1"/>
       </w:pPr>
-      <w:bookmarkStart w:id="10" w:name="_Toc213253508"/>
-      <w:r>
+      <w:bookmarkStart w:id="9" w:name="_Toc213253508"/>
+      <w:r>
+        <w:lastRenderedPageBreak/>
         <w:t>Взаимозависимости</w:t>
       </w:r>
-      <w:bookmarkEnd w:id="10"/>
+      <w:bookmarkEnd w:id="9"/>
     </w:p>
     <w:p>
       <w:pPr>
@@ -3422,31 +3978,42 @@
           <w:bCs/>
           <w:szCs w:val="20"/>
         </w:rPr>
-        <w:t>войство B</w:t>
-      </w:r>
-      <w:r>
-        <w:rPr>
-          <w:szCs w:val="20"/>
-        </w:rPr>
-        <w:t> (</w:t>
-      </w:r>
-      <w:r>
-        <w:rPr>
-          <w:szCs w:val="20"/>
-        </w:rPr>
-        <w:t>с</w:t>
-      </w:r>
-      <w:r>
-        <w:rPr>
-          <w:szCs w:val="20"/>
-        </w:rPr>
-        <w:t>оздание и отображение заказов) должен выполняться перед </w:t>
+        <w:t xml:space="preserve">войство </w:t>
       </w:r>
       <w:r>
         <w:rPr>
           <w:b/>
           <w:bCs/>
           <w:szCs w:val="20"/>
+          <w:lang w:val="en-US"/>
+        </w:rPr>
+        <w:t>A</w:t>
+      </w:r>
+      <w:bookmarkStart w:id="10" w:name="_GoBack"/>
+      <w:bookmarkEnd w:id="10"/>
+      <w:r>
+        <w:rPr>
+          <w:szCs w:val="20"/>
+        </w:rPr>
+        <w:t> (</w:t>
+      </w:r>
+      <w:r>
+        <w:rPr>
+          <w:szCs w:val="20"/>
+        </w:rPr>
+        <w:t>с</w:t>
+      </w:r>
+      <w:r>
+        <w:rPr>
+          <w:szCs w:val="20"/>
+        </w:rPr>
+        <w:t>оздание и отображение заказов) должен выполняться перед </w:t>
+      </w:r>
+      <w:r>
+        <w:rPr>
+          <w:b/>
+          <w:bCs/>
+          <w:szCs w:val="20"/>
         </w:rPr>
         <w:t>тестом 2, свойство А</w:t>
       </w:r>
@@ -3488,7 +4055,6 @@
           <w:bCs/>
           <w:szCs w:val="20"/>
         </w:rPr>
-        <w:lastRenderedPageBreak/>
         <w:t>Тест 1, Свойство B</w:t>
       </w:r>
       <w:r>
@@ -4058,6 +4624,7 @@
         <w:ind w:firstLine="414"/>
       </w:pPr>
       <w:r>
+        <w:lastRenderedPageBreak/>
         <w:t>Загрузка личного кабинета занимает до 3-х секунд.</w:t>
       </w:r>
     </w:p>
@@ -4110,7 +4677,6 @@
         </w:rPr>
       </w:pPr>
       <w:r>
-        <w:lastRenderedPageBreak/>
         <w:t>Замечания</w:t>
       </w:r>
       <w:r>
@@ -4497,6 +5063,7 @@
         </w:rPr>
       </w:pPr>
       <w:r>
+        <w:lastRenderedPageBreak/>
         <w:t>Ожидаемая достоверность</w:t>
       </w:r>
       <w:r>
@@ -4527,7 +5094,6 @@
         <w:ind w:firstLine="414"/>
       </w:pPr>
       <w:r>
-        <w:lastRenderedPageBreak/>
         <w:t>Изменение видно всем пользователям, имеющим доступ к заказу.</w:t>
       </w:r>
     </w:p>
@@ -10179,6 +10745,50 @@
     <w:lsdException w:name="Strong" w:uiPriority="22" w:qFormat="1"/>
     <w:lsdException w:name="Emphasis" w:qFormat="1"/>
     <w:lsdException w:name="HTML Code" w:uiPriority="99"/>
+    <w:lsdException w:name="Normal Table" w:semiHidden="1" w:unhideWhenUsed="1"/>
+    <w:lsdException w:name="Table Simple 1" w:semiHidden="1" w:unhideWhenUsed="1"/>
+    <w:lsdException w:name="Table Simple 2" w:semiHidden="1" w:unhideWhenUsed="1"/>
+    <w:lsdException w:name="Table Simple 3" w:semiHidden="1" w:unhideWhenUsed="1"/>
+    <w:lsdException w:name="Table Classic 1" w:semiHidden="1" w:unhideWhenUsed="1"/>
+    <w:lsdException w:name="Table Classic 2" w:semiHidden="1" w:unhideWhenUsed="1"/>
+    <w:lsdException w:name="Table Classic 3" w:semiHidden="1" w:unhideWhenUsed="1"/>
+    <w:lsdException w:name="Table Classic 4" w:semiHidden="1" w:unhideWhenUsed="1"/>
+    <w:lsdException w:name="Table Colorful 1" w:semiHidden="1" w:unhideWhenUsed="1"/>
+    <w:lsdException w:name="Table Colorful 2" w:semiHidden="1" w:unhideWhenUsed="1"/>
+    <w:lsdException w:name="Table Colorful 3" w:semiHidden="1" w:unhideWhenUsed="1"/>
+    <w:lsdException w:name="Table Columns 1" w:semiHidden="1" w:unhideWhenUsed="1"/>
+    <w:lsdException w:name="Table Columns 2" w:semiHidden="1" w:unhideWhenUsed="1"/>
+    <w:lsdException w:name="Table Columns 3" w:semiHidden="1" w:unhideWhenUsed="1"/>
+    <w:lsdException w:name="Table Columns 4" w:semiHidden="1" w:unhideWhenUsed="1"/>
+    <w:lsdException w:name="Table Columns 5" w:semiHidden="1" w:unhideWhenUsed="1"/>
+    <w:lsdException w:name="Table Grid 1" w:semiHidden="1" w:unhideWhenUsed="1"/>
+    <w:lsdException w:name="Table Grid 2" w:semiHidden="1" w:unhideWhenUsed="1"/>
+    <w:lsdException w:name="Table Grid 3" w:semiHidden="1" w:unhideWhenUsed="1"/>
+    <w:lsdException w:name="Table Grid 4" w:semiHidden="1" w:unhideWhenUsed="1"/>
+    <w:lsdException w:name="Table Grid 5" w:semiHidden="1" w:unhideWhenUsed="1"/>
+    <w:lsdException w:name="Table Grid 6" w:semiHidden="1" w:unhideWhenUsed="1"/>
+    <w:lsdException w:name="Table Grid 7" w:semiHidden="1" w:unhideWhenUsed="1"/>
+    <w:lsdException w:name="Table Grid 8" w:semiHidden="1" w:unhideWhenUsed="1"/>
+    <w:lsdException w:name="Table List 1" w:semiHidden="1" w:unhideWhenUsed="1"/>
+    <w:lsdException w:name="Table List 2" w:semiHidden="1" w:unhideWhenUsed="1"/>
+    <w:lsdException w:name="Table List 3" w:semiHidden="1" w:unhideWhenUsed="1"/>
+    <w:lsdException w:name="Table List 4" w:semiHidden="1" w:unhideWhenUsed="1"/>
+    <w:lsdException w:name="Table List 5" w:semiHidden="1" w:unhideWhenUsed="1"/>
+    <w:lsdException w:name="Table List 6" w:semiHidden="1" w:unhideWhenUsed="1"/>
+    <w:lsdException w:name="Table List 7" w:semiHidden="1" w:unhideWhenUsed="1"/>
+    <w:lsdException w:name="Table List 8" w:semiHidden="1" w:unhideWhenUsed="1"/>
+    <w:lsdException w:name="Table 3D effects 1" w:semiHidden="1" w:unhideWhenUsed="1"/>
+    <w:lsdException w:name="Table 3D effects 2" w:semiHidden="1" w:unhideWhenUsed="1"/>
+    <w:lsdException w:name="Table 3D effects 3" w:semiHidden="1" w:unhideWhenUsed="1"/>
+    <w:lsdException w:name="Table Contemporary" w:semiHidden="1" w:unhideWhenUsed="1"/>
+    <w:lsdException w:name="Table Elegant" w:semiHidden="1" w:unhideWhenUsed="1"/>
+    <w:lsdException w:name="Table Professional" w:semiHidden="1" w:unhideWhenUsed="1"/>
+    <w:lsdException w:name="Table Subtle 1" w:semiHidden="1" w:unhideWhenUsed="1"/>
+    <w:lsdException w:name="Table Subtle 2" w:semiHidden="1" w:unhideWhenUsed="1"/>
+    <w:lsdException w:name="Table Web 1" w:semiHidden="1" w:unhideWhenUsed="1"/>
+    <w:lsdException w:name="Table Web 2" w:semiHidden="1" w:unhideWhenUsed="1"/>
+    <w:lsdException w:name="Table Web 3" w:semiHidden="1" w:unhideWhenUsed="1"/>
+    <w:lsdException w:name="Table Theme" w:semiHidden="1" w:unhideWhenUsed="1"/>
     <w:lsdException w:name="Placeholder Text" w:semiHidden="1" w:uiPriority="99"/>
     <w:lsdException w:name="No Spacing" w:uiPriority="1" w:qFormat="1"/>
     <w:lsdException w:name="Light Shading" w:uiPriority="60"/>
@@ -10569,11 +11179,15 @@
   </w:style>
   <w:style w:type="character" w:default="1" w:styleId="a0">
     <w:name w:val="Default Paragraph Font"/>
+    <w:uiPriority w:val="1"/>
     <w:semiHidden/>
+    <w:unhideWhenUsed/>
   </w:style>
   <w:style w:type="table" w:default="1" w:styleId="a1">
     <w:name w:val="Normal Table"/>
+    <w:uiPriority w:val="99"/>
     <w:semiHidden/>
+    <w:unhideWhenUsed/>
     <w:tblPr>
       <w:tblInd w:w="0" w:type="dxa"/>
       <w:tblCellMar>
@@ -10586,9 +11200,11 @@
   </w:style>
   <w:style w:type="numbering" w:default="1" w:styleId="a2">
     <w:name w:val="No List"/>
+    <w:uiPriority w:val="99"/>
     <w:semiHidden/>
+    <w:unhideWhenUsed/>
   </w:style>
-  <w:style w:type="paragraph" w:styleId="a3">
+  <w:style w:type="paragraph" w:customStyle="1" w:styleId="a3">
     <w:name w:val="Название"/>
     <w:basedOn w:val="a"/>
     <w:next w:val="a"/>

</xml_diff>